<commit_message>
Updated Start_Game.bat to auto-install dependencies on lab PCs
</commit_message>
<xml_diff>
--- a/Final_Project_Report.docx
+++ b/Final_Project_Report.docx
@@ -256,13 +256,7 @@
               <w:rPr>
                 <w:rFonts w:ascii="Calibri" w:hAnsi="Calibri"/>
               </w:rPr>
-              <w:t xml:space="preserve">14 </w:t>
-            </w:r>
-            <w:r>
-              <w:rPr>
-                <w:rFonts w:ascii="Calibri" w:hAnsi="Calibri"/>
-              </w:rPr>
-              <w:t>June 2026</w:t>
+              <w:t>14 June 2026</w:t>
             </w:r>
           </w:p>
         </w:tc>
@@ -271,12 +265,21 @@
     <w:p/>
     <w:p>
       <w:pPr>
+        <w:tabs>
+          <w:tab w:val="left" w:pos="5820"/>
+        </w:tabs>
         <w:spacing w:before="80" w:after="120"/>
+        <w:rPr>
+          <w:sz w:val="32"/>
+          <w:szCs w:val="32"/>
+        </w:rPr>
       </w:pPr>
       <w:r>
         <w:rPr>
           <w:rFonts w:ascii="Calibri" w:hAnsi="Calibri"/>
           <w:b/>
+          <w:sz w:val="32"/>
+          <w:szCs w:val="32"/>
         </w:rPr>
         <w:t>Team Members</w:t>
       </w:r>
@@ -284,6 +287,8 @@
         <w:rPr>
           <w:rFonts w:ascii="Calibri" w:hAnsi="Calibri"/>
           <w:b/>
+          <w:sz w:val="32"/>
+          <w:szCs w:val="32"/>
         </w:rPr>
         <w:t xml:space="preserve"> Collaboration</w:t>
       </w:r>
@@ -291,12 +296,26 @@
         <w:rPr>
           <w:rFonts w:ascii="Calibri" w:hAnsi="Calibri"/>
           <w:b/>
+          <w:sz w:val="32"/>
+          <w:szCs w:val="32"/>
         </w:rPr>
         <w:t>:</w:t>
+      </w:r>
+      <w:r>
+        <w:rPr>
+          <w:rFonts w:ascii="Calibri" w:hAnsi="Calibri"/>
+          <w:b/>
+          <w:sz w:val="32"/>
+          <w:szCs w:val="32"/>
+        </w:rPr>
+        <w:tab/>
       </w:r>
     </w:p>
     <w:p>
       <w:r>
+        <w:rPr>
+          <w:noProof/>
+        </w:rPr>
         <w:drawing>
           <wp:inline distT="0" distB="0" distL="0" distR="0" wp14:anchorId="19269212" wp14:editId="47A1EB6E">
             <wp:extent cx="13058775" cy="4295775"/>
@@ -11275,7 +11294,7 @@
           <w:color w:val="0F3460"/>
           <w:sz w:val="24"/>
         </w:rPr>
-        <w:t>9.2 Future Improvement Scope</w:t>
+        <w:t xml:space="preserve">9.2 </w:t>
       </w:r>
       <w:r>
         <w:rPr>
@@ -11284,141 +11303,93 @@
           <w:color w:val="0F3460"/>
           <w:sz w:val="24"/>
         </w:rPr>
-        <w:br/>
-      </w:r>
-      <w:r>
-        <w:t>| Future Feature | Description |</w:t>
+        <w:t>9.2 Future Scope</w:t>
       </w:r>
     </w:p>
     <w:p>
       <w:pPr>
-        <w:keepNext/>
-        <w:spacing w:before="240" w:after="120"/>
-      </w:pPr>
-      <w:r>
-        <w:t>|---|---|</w:t>
+        <w:spacing w:before="80" w:after="120"/>
+      </w:pPr>
+      <w:r>
+        <w:rPr>
+          <w:rFonts w:ascii="Calibri" w:hAnsi="Calibri"/>
+        </w:rPr>
+        <w:t>In near future we would look into:</w:t>
       </w:r>
     </w:p>
     <w:p>
       <w:pPr>
-        <w:keepNext/>
-        <w:spacing w:before="240" w:after="120"/>
-      </w:pPr>
-      <w:r>
-        <w:t xml:space="preserve">| </w:t>
-      </w:r>
+        <w:spacing w:before="40" w:after="40"/>
+        <w:ind w:left="360"/>
+      </w:pPr>
       <w:r>
         <w:rPr>
           <w:b/>
-          <w:bCs/>
-        </w:rPr>
-        <w:t>**Deep Q-Network (DQN)**</w:t>
-      </w:r>
-      <w:r>
-        <w:t xml:space="preserve"> | Replace metaheuristics with a neural network that learns the optimal policy through trial-and-error rewards |</w:t>
+        </w:rPr>
+        <w:t xml:space="preserve">• </w:t>
+      </w:r>
+      <w:r>
+        <w:rPr>
+          <w:rFonts w:ascii="Calibri" w:hAnsi="Calibri"/>
+          <w:b/>
+        </w:rPr>
+        <w:t>Deep Q-Networks (DQN)</w:t>
+      </w:r>
+      <w:r>
+        <w:rPr>
+          <w:rFonts w:ascii="Calibri" w:hAnsi="Calibri"/>
+        </w:rPr>
+        <w:t>: Replace our search algorithms with a neural network that learns how to play through trial and error.</w:t>
       </w:r>
     </w:p>
     <w:p>
       <w:pPr>
-        <w:keepNext/>
-        <w:spacing w:before="240" w:after="120"/>
-      </w:pPr>
-      <w:r>
-        <w:t xml:space="preserve">| </w:t>
-      </w:r>
+        <w:spacing w:before="40" w:after="40"/>
+        <w:ind w:left="360"/>
+      </w:pPr>
       <w:r>
         <w:rPr>
           <w:b/>
-          <w:bCs/>
-        </w:rPr>
-        <w:t>**Dynamic Moving Ghosts**</w:t>
-      </w:r>
-      <w:r>
-        <w:t xml:space="preserve"> | Implement Minimax or Monte Carlo Tree Search (MCTS) for adversarial ghost agents |</w:t>
+        </w:rPr>
+        <w:t xml:space="preserve">• </w:t>
+      </w:r>
+      <w:r>
+        <w:rPr>
+          <w:rFonts w:ascii="Calibri" w:hAnsi="Calibri"/>
+          <w:b/>
+        </w:rPr>
+        <w:t>Moving Ghosts</w:t>
+      </w:r>
+      <w:r>
+        <w:rPr>
+          <w:rFonts w:ascii="Calibri" w:hAnsi="Calibri"/>
+        </w:rPr>
+        <w:t>: Make the ghosts move around the maze using Minimax search or state machines, turning this into a real-time evasion game.</w:t>
       </w:r>
     </w:p>
     <w:p>
       <w:pPr>
-        <w:keepNext/>
-        <w:spacing w:before="240" w:after="120"/>
-      </w:pPr>
-      <w:r>
-        <w:t xml:space="preserve">| </w:t>
-      </w:r>
+        <w:spacing w:before="40" w:after="40"/>
+        <w:ind w:left="360"/>
+      </w:pPr>
       <w:r>
         <w:rPr>
           <w:b/>
-          <w:bCs/>
-        </w:rPr>
-        <w:t>**Larger Grid Support**</w:t>
-      </w:r>
-      <w:r>
-        <w:t xml:space="preserve"> | Scale to 30×30 or 50×50 mazes to stress-test algorithm scalability |</w:t>
-      </w:r>
-    </w:p>
-    <w:p>
-      <w:pPr>
-        <w:keepNext/>
-        <w:spacing w:before="240" w:after="120"/>
-      </w:pPr>
-      <w:r>
-        <w:t xml:space="preserve">| </w:t>
-      </w:r>
-      <w:r>
-        <w:rPr>
+        </w:rPr>
+        <w:t xml:space="preserve">• </w:t>
+      </w:r>
+      <w:r>
+        <w:rPr>
+          <w:rFonts w:ascii="Calibri" w:hAnsi="Calibri"/>
           <w:b/>
-          <w:bCs/>
-        </w:rPr>
-        <w:t>**Batch Benchmarking**</w:t>
-      </w:r>
-      <w:r>
-        <w:t xml:space="preserve"> | Auto-run all 4 algorithms across all 3 mazes and export results to CSV for statistical analysis |</w:t>
-      </w:r>
-    </w:p>
-    <w:p>
-      <w:pPr>
-        <w:keepNext/>
-        <w:spacing w:before="240" w:after="120"/>
-      </w:pPr>
-      <w:r>
-        <w:t xml:space="preserve">| </w:t>
-      </w:r>
-      <w:r>
-        <w:rPr>
-          <w:b/>
-          <w:bCs/>
-        </w:rPr>
-        <w:t>**Genetic Algorithm**</w:t>
-      </w:r>
-      <w:r>
-        <w:t xml:space="preserve"> | Add a fifth optimizer using evolutionary crossover and mutation for TSP solving |</w:t>
-      </w:r>
-    </w:p>
-    <w:p>
-      <w:pPr>
-        <w:keepNext/>
-        <w:spacing w:before="240" w:after="120"/>
-      </w:pPr>
-      <w:r>
-        <w:t xml:space="preserve">| </w:t>
-      </w:r>
-      <w:r>
-        <w:rPr>
-          <w:b/>
-          <w:bCs/>
-        </w:rPr>
-        <w:t>**Web Browser Port**</w:t>
-      </w:r>
-      <w:r>
-        <w:t xml:space="preserve"> | Port the simulation to a </w:t>
-      </w:r>
-      <w:proofErr w:type="spellStart"/>
-      <w:r>
-        <w:t>WebAssembly</w:t>
-      </w:r>
-      <w:proofErr w:type="spellEnd"/>
-      <w:r>
-        <w:t xml:space="preserve"> or JavaScript canvas for browser-based demonstration without Python installation |</w:t>
+        </w:rPr>
+        <w:t>Statistical Loggers</w:t>
+      </w:r>
+      <w:r>
+        <w:rPr>
+          <w:rFonts w:ascii="Calibri" w:hAnsi="Calibri"/>
+        </w:rPr>
+        <w:t>: Add a feature to run 100 trials automatically and export the data to a CSV file for statistical plotting.</w:t>
       </w:r>
     </w:p>
     <w:p>
@@ -12243,6 +12214,7 @@
   <w:style w:type="character" w:default="1" w:styleId="DefaultParagraphFont">
     <w:name w:val="Default Paragraph Font"/>
     <w:uiPriority w:val="1"/>
+    <w:semiHidden/>
     <w:unhideWhenUsed/>
   </w:style>
   <w:style w:type="table" w:default="1" w:styleId="TableNormal">

</xml_diff>